<commit_message>
add: Agregar nombre Pedro y puesto Programador en archivo Actividad - Proyecto JavaEE.docx
</commit_message>
<xml_diff>
--- a/Actividad - Proyecto JavaEE.docx
+++ b/Actividad - Proyecto JavaEE.docx
@@ -730,9 +730,14 @@
               <w:jc w:val="center"/>
               <w:rPr>
                 <w:noProof/>
-                <w:u w:val="single"/>
               </w:rPr>
             </w:pPr>
+            <w:r>
+              <w:rPr>
+                <w:noProof/>
+              </w:rPr>
+              <w:t>Pedro</w:t>
+            </w:r>
           </w:p>
         </w:tc>
         <w:tc>
@@ -751,6 +756,12 @@
                 <w:noProof/>
               </w:rPr>
             </w:pPr>
+            <w:r>
+              <w:rPr>
+                <w:noProof/>
+              </w:rPr>
+              <w:t>Programador</w:t>
+            </w:r>
           </w:p>
         </w:tc>
       </w:tr>

</xml_diff>

<commit_message>
add: Agregar nombre Programador1 y puesto Programador en Actividad - Proyecto JavaEE.docx
</commit_message>
<xml_diff>
--- a/Actividad - Proyecto JavaEE.docx
+++ b/Actividad - Proyecto JavaEE.docx
@@ -730,9 +730,14 @@
               <w:jc w:val="center"/>
               <w:rPr>
                 <w:noProof/>
-                <w:u w:val="single"/>
               </w:rPr>
             </w:pPr>
+            <w:r>
+              <w:rPr>
+                <w:noProof/>
+              </w:rPr>
+              <w:t>Programador1</w:t>
+            </w:r>
           </w:p>
         </w:tc>
         <w:tc>
@@ -751,6 +756,12 @@
                 <w:noProof/>
               </w:rPr>
             </w:pPr>
+            <w:r>
+              <w:rPr>
+                <w:noProof/>
+              </w:rPr>
+              <w:t>Programador</w:t>
+            </w:r>
           </w:p>
         </w:tc>
       </w:tr>

</xml_diff>